<commit_message>
Harden price patch resilience and restore safety
</commit_message>
<xml_diff>
--- a/output/doc/使用文档.docx
+++ b/output/doc/使用文档.docx
@@ -545,7 +545,7 @@
           <w:rFonts w:ascii="微软雅黑" w:hAnsi="微软雅黑" w:eastAsia="微软雅黑"/>
           <w:sz w:val="22"/>
         </w:rPr>
-        <w:t>4. 程序会抓取 poe2scout 国际服价格，并把价格追加为“=数字D/E”。</w:t>
+        <w:t>4. 程序会按客户端类型抓取价格：国际服优先 poe2scout，国服优先 poecurrency.top；异常分类会自动降级，D/E 比例使用当前数据源实时值。</w:t>
       </w:r>
     </w:p>
     <w:p>
@@ -557,7 +557,7 @@
           <w:rFonts w:ascii="微软雅黑" w:hAnsi="微软雅黑" w:eastAsia="微软雅黑"/>
           <w:sz w:val="22"/>
         </w:rPr>
-        <w:t>5. 程序会生成“物价补丁.zip”和“还原物价补丁.zip”。Bundles2 模式还会生成“真实还原物价补丁.zip”。</w:t>
+        <w:t>5. 程序会生成“物价补丁.zip”和“还原物价补丁.zip”。Bundles2 模式还会生成“真实还原物价补丁.zip”，并在游戏根目录的 .poe2-price-patch 文件夹保存持久副本。旧版备份丢失时，会先在临时沙盒清理并校验，成功前不修改真实游戏。</w:t>
       </w:r>
     </w:p>
     <w:p>
@@ -569,7 +569,7 @@
           <w:rFonts w:ascii="微软雅黑" w:hAnsi="微软雅黑" w:eastAsia="微软雅黑"/>
           <w:sz w:val="22"/>
         </w:rPr>
-        <w:t>6. 程序会把补丁写回对应游戏包。</w:t>
+        <w:t>6. 价格文件会先在隔离目录生成并校验；实时数据失败时仅使用当前范围和模式的兼容核心缓存。写入前复核游戏文件未被并发修改，写入后读回核对；失败会自动恢复。没有安全候选时只停止本次更新，不覆盖当前游戏。</w:t>
       </w:r>
     </w:p>
     <w:p>
@@ -618,7 +618,7 @@
           <w:rFonts w:ascii="微软雅黑" w:hAnsi="微软雅黑" w:eastAsia="微软雅黑"/>
           <w:sz w:val="22"/>
         </w:rPr>
-        <w:t>3. Bundles2 模式会使用“真实还原物价补丁.zip”恢复打补丁前的物理文件。</w:t>
+        <w:t>3. Bundles2 模式优先验证并使用“真实还原物价补丁.zip”，无需先准备 .NET；替换后核对精确文件集合，失败会恢复操作前状态。</w:t>
       </w:r>
     </w:p>
     <w:p>
@@ -630,7 +630,7 @@
           <w:rFonts w:ascii="微软雅黑" w:hAnsi="微软雅黑" w:eastAsia="微软雅黑"/>
           <w:sz w:val="22"/>
         </w:rPr>
-        <w:t>4. GGPK 模式会使用“还原物价补丁.zip”写回当前客户端对应的 BaseItemTypes。</w:t>
+        <w:t>4. GGPK 模式会使用“还原物价补丁.zip”写回当前语言目标，随后逐条读回校验；写入或校验失败会自动重试一次。</w:t>
       </w:r>
     </w:p>
     <w:p>
@@ -642,7 +642,7 @@
           <w:rFonts w:ascii="微软雅黑" w:hAnsi="微软雅黑" w:eastAsia="微软雅黑"/>
           <w:sz w:val="22"/>
         </w:rPr>
-        <w:t>5. 如果没有可用还原包，程序会拒绝做不完整还原。</w:t>
+        <w:t>5. 如果没有物理还原包，程序会验证逻辑还原包，并以当前 Bundles2 的 Words/EndgameMaps 为底板只清理本工具标记；没有安全兼容路径时才会拒绝还原。</w:t>
       </w:r>
     </w:p>
     <w:p>
@@ -707,7 +707,7 @@
           <w:rFonts w:ascii="微软雅黑" w:hAnsi="微软雅黑" w:eastAsia="微软雅黑"/>
           <w:sz w:val="22"/>
         </w:rPr>
-        <w:t>Bundles2 模式不覆盖完整 _.index.bin 或 Tiny*.bundle.bin。</w:t>
+        <w:t>Bundles2 模式会更新 _.index.bin 并向 LibGGPK3 写入增量内容，不会直接覆盖 Tiny*.bundle.bin。</w:t>
       </w:r>
     </w:p>
     <w:p>
@@ -720,7 +720,7 @@
           <w:rFonts w:ascii="微软雅黑" w:hAnsi="微软雅黑" w:eastAsia="微软雅黑"/>
           <w:sz w:val="22"/>
         </w:rPr>
-        <w:t>Bundles2 还原会恢复安装前备份的 _.index.bin 和 LibGGPK3 状态。</w:t>
+        <w:t>Bundles2 还原优先恢复安装前备份的 _.index.bin 和 LibGGPK3；迁移基线则恢复到语义上干净的物价层。</w:t>
       </w:r>
     </w:p>
     <w:p>
@@ -824,7 +824,7 @@
           <w:rFonts w:ascii="微软雅黑" w:hAnsi="微软雅黑" w:eastAsia="微软雅黑"/>
           <w:sz w:val="22"/>
         </w:rPr>
-        <w:t>真实还原物价补丁.zip：Bundles2 模式的物理级恢复包。</w:t>
+        <w:t>真实还原物价补丁.zip：Bundles2 模式的恢复包；持久副本位于 &lt;游戏根目录&gt;\.poe2-price-patch。</w:t>
       </w:r>
     </w:p>
     <w:p>
@@ -837,7 +837,7 @@
           <w:rFonts w:ascii="微软雅黑" w:hAnsi="微软雅黑" w:eastAsia="微软雅黑"/>
           <w:sz w:val="22"/>
         </w:rPr>
-        <w:t>tools\dotnet-runtime：内置 .NET 8 runtime，不要删除。</w:t>
+        <w:t>tools\dotnet-runtime：内置 .NET 8.0.28 runtime，不要删除；发布包另含校验过的离线修复包，只有两者都不可用时才访问 Microsoft 备用源。</w:t>
       </w:r>
     </w:p>
     <w:p>
@@ -850,7 +850,7 @@
           <w:rFonts w:ascii="微软雅黑" w:hAnsi="微软雅黑" w:eastAsia="微软雅黑"/>
           <w:sz w:val="22"/>
         </w:rPr>
-        <w:t>tools\python：内置 Python 和依赖，不要删除。</w:t>
+        <w:t>tools\python：内置 Python 和依赖，不要删除；自动修复时依次尝试华为云、阿里云、南京大学镜像和 Python 官方备用源。</w:t>
       </w:r>
     </w:p>
     <w:p>
@@ -951,7 +951,7 @@
           <w:rFonts w:ascii="微软雅黑" w:hAnsi="微软雅黑" w:eastAsia="微软雅黑"/>
           <w:sz w:val="22"/>
         </w:rPr>
-        <w:t>提示找不到游戏目录：请确认物价补丁文件夹放在 POE2 游戏根目录。</w:t>
+        <w:t>提示找不到游戏目录：请确认物价补丁文件夹放在 POE2 游戏根目录。若提示旧补丁有标记但备份丢失，新版会搜索旧文件夹并尝试离线沙盒迁移；失败时真实游戏不会被修改。</w:t>
       </w:r>
     </w:p>
     <w:p>
@@ -964,7 +964,7 @@
           <w:rFonts w:ascii="微软雅黑" w:hAnsi="微软雅黑" w:eastAsia="微软雅黑"/>
           <w:sz w:val="22"/>
         </w:rPr>
-        <w:t>提取或写入失败：请先关闭游戏和可能占用文件的工具。</w:t>
+        <w:t>提取或写入失败：程序会等待短暂占用并在写入失败时自动恢复；仍失败时请关闭游戏和可能占用文件的工具后重试。</w:t>
       </w:r>
     </w:p>
     <w:p>
@@ -977,7 +977,7 @@
           <w:rFonts w:ascii="微软雅黑" w:hAnsi="微软雅黑" w:eastAsia="微软雅黑"/>
           <w:sz w:val="22"/>
         </w:rPr>
-        <w:t>缺少价格：可能是 poe2scout 暂无该物品数据，或英文名无法匹配本地物品表。</w:t>
+        <w:t>缺少价格：可能是当前数据源暂无该物品，或名称无法匹配本地表。低匹配会保留未命中的旧价格；数据源完全不可用时保留当前补丁。</w:t>
       </w:r>
     </w:p>
     <w:p>

</xml_diff>

<commit_message>
Add unified POE1 and POE2 price patch
</commit_message>
<xml_diff>
--- a/output/doc/使用文档.docx
+++ b/output/doc/使用文档.docx
@@ -12,7 +12,7 @@
           <w:b/>
           <w:sz w:val="40"/>
         </w:rPr>
-        <w:t>POE2 三服合一物价补丁使用文档 v0.4.9.7</w:t>
+        <w:t>POE1 / POE2 物价补丁使用文档 v0.5.0</w:t>
       </w:r>
     </w:p>
     <w:p>
@@ -57,7 +57,7 @@
           <w:color w:val="C00000"/>
           <w:sz w:val="28"/>
         </w:rPr>
-        <w:t>更新和还原都会自动识别国服 WeGame、国际服官方 GGPK、国际服 Steam/Epic Bundles2，也可以手动选择游戏目录。</w:t>
+        <w:t>更新和还原都会自动识别 POE1 / POE2、国服 WeGame、国际服官方 GGPK、国际服 Steam/Epic Bundles2，也可以手动选择游戏目录。</w:t>
       </w:r>
     </w:p>
     <w:p>
@@ -135,7 +135,7 @@
           <w:rFonts w:ascii="微软雅黑" w:hAnsi="微软雅黑" w:eastAsia="微软雅黑"/>
           <w:sz w:val="22"/>
         </w:rPr>
-        <w:t>&lt;POE2游戏根目录&gt;\物价补丁\一键更新物价补丁.exe</w:t>
+        <w:t>&lt;POE2游戏根目录&gt;\物价补丁\物价补丁.exe</w:t>
       </w:r>
     </w:p>
     <w:p>
@@ -148,7 +148,7 @@
           <w:rFonts w:ascii="微软雅黑" w:hAnsi="微软雅黑" w:eastAsia="微软雅黑"/>
           <w:sz w:val="22"/>
         </w:rPr>
-        <w:t>&lt;POE2游戏根目录&gt;\物价补丁\一键还原物价补丁.exe</w:t>
+        <w:t>&lt;POE2游戏根目录&gt;\物价补丁\物价补丁.exe</w:t>
       </w:r>
     </w:p>
     <w:p>
@@ -480,7 +480,7 @@
           <w:b/>
           <w:sz w:val="26"/>
         </w:rPr>
-        <w:t>三、一键</w:t>
+        <w:t>三、统一操作入口</w:t>
       </w:r>
       <w:r>
         <w:rPr>
@@ -489,7 +489,6 @@
           <w:sz w:val="26"/>
           <w:lang w:val="en-US" w:eastAsia="zh-CN"/>
         </w:rPr>
-        <w:t>启动/</w:t>
       </w:r>
       <w:r>
         <w:rPr>
@@ -497,7 +496,6 @@
           <w:b/>
           <w:sz w:val="26"/>
         </w:rPr>
-        <w:t>更新</w:t>
       </w:r>
     </w:p>
     <w:p>
@@ -521,7 +519,7 @@
           <w:rFonts w:ascii="微软雅黑" w:hAnsi="微软雅黑" w:eastAsia="微软雅黑"/>
           <w:sz w:val="22"/>
         </w:rPr>
-        <w:t>2. 双击“一键更新物价补丁.exe”。</w:t>
+        <w:t>2. 双击“物价补丁.exe”，确认自动识别的路径和客户端类型，或手动选择要更新的游戏目录；点击底部“开始/更新物价补丁”执行更新。</w:t>
       </w:r>
     </w:p>
     <w:p>
@@ -545,7 +543,7 @@
           <w:rFonts w:ascii="微软雅黑" w:hAnsi="微软雅黑" w:eastAsia="微软雅黑"/>
           <w:sz w:val="22"/>
         </w:rPr>
-        <w:t>4. 程序会按客户端类型抓取价格：国际服优先 poe2scout，国服优先 poecurrency.top；异常分类会自动降级，D/E 比例使用当前数据源实时值。同一个显示名对应多个游戏元数据路径时会为全部别名写入价格；国服翻译重名时使用 engname 英文别名消歧，避免漏价或串价。</w:t>
+        <w:t>4. 程序会按版本和客户端类型抓取价格：POE1 国际服使用 poe.ninja，POE1 国服使用 poecurrency.top，POE2 国际服优先 poe2scout；异常分类会自动降级，POE1 使用 C/D，POE2 使用 D/E，比例使用当前数据源实时值。同一个显示名对应多个游戏元数据路径时会为全部别名写入价格；国服翻译重名时使用 engname 英文别名消歧，避免漏价或串价。</w:t>
       </w:r>
     </w:p>
     <w:p>
@@ -582,7 +580,7 @@
           <w:b/>
           <w:sz w:val="26"/>
         </w:rPr>
-        <w:t>四、一键还原</w:t>
+        <w:t>四、还原物价补丁</w:t>
       </w:r>
     </w:p>
     <w:p>
@@ -606,7 +604,7 @@
           <w:rFonts w:ascii="微软雅黑" w:hAnsi="微软雅黑" w:eastAsia="微软雅黑"/>
           <w:sz w:val="22"/>
         </w:rPr>
-        <w:t>2. 双击“一键还原物价补丁.exe”，在还原窗口中确认自动识别的路径和客户端类型，或手动选择要还原的游戏目录。</w:t>
+        <w:t>2. 双击“物价补丁.exe”，确认自动识别的路径和客户端类型，或手动选择要还原的游戏目录；点击底部“还原物价补丁”执行还原。</w:t>
       </w:r>
     </w:p>
     <w:p>
@@ -772,7 +770,7 @@
           <w:rFonts w:ascii="微软雅黑" w:hAnsi="微软雅黑" w:eastAsia="微软雅黑"/>
           <w:sz w:val="22"/>
         </w:rPr>
-        <w:t>一键更新物价补丁.exe：抓价、生成补丁并写入游戏包。</w:t>
+        <w:t>物价补丁.exe：统一 GUI 入口；可选择更新或还原、POE1 或 POE2、自动识别或手动路径。</w:t>
       </w:r>
     </w:p>
     <w:p>
@@ -785,7 +783,7 @@
           <w:rFonts w:ascii="微软雅黑" w:hAnsi="微软雅黑" w:eastAsia="微软雅黑"/>
           <w:sz w:val="22"/>
         </w:rPr>
-        <w:t>一键还原物价补丁.exe：还原对应 BaseItemTypes。</w:t>
+        <w:t>物价补丁.exe：统一 GUI 入口；可选择更新或还原、POE1 或 POE2、自动识别或手动路径。</w:t>
       </w:r>
     </w:p>
     <w:p>
@@ -1042,7 +1040,7 @@
         <w:color w:val="808080"/>
         <w:sz w:val="18"/>
       </w:rPr>
-      <w:t>POE2 三服合一物价补丁 v0.4.9.7</w:t>
+      <w:t>POE1 / POE2 物价补丁 v0.5.0</w:t>
     </w:r>
   </w:p>
 </w:ftr>

</xml_diff>

<commit_message>
feat: add unified POE1 multi-source price patch
</commit_message>
<xml_diff>
--- a/output/doc/使用文档.docx
+++ b/output/doc/使用文档.docx
@@ -12,7 +12,7 @@
           <w:b/>
           <w:sz w:val="40"/>
         </w:rPr>
-        <w:t>POE1 / POE2 物价补丁使用文档 v0.5.0</w:t>
+        <w:t>POE1 / POE2 物价补丁使用文档 v0.5.2</w:t>
       </w:r>
     </w:p>
     <w:p>
@@ -109,7 +109,7 @@
           <w:rFonts w:ascii="微软雅黑" w:hAnsi="微软雅黑" w:eastAsia="微软雅黑"/>
           <w:sz w:val="22"/>
         </w:rPr>
-        <w:t>&lt;POE2游戏根目录&gt;\Content.ggpk</w:t>
+        <w:t>&lt;POE1 或 POE2 游戏根目录&gt;\Content.ggpk</w:t>
       </w:r>
     </w:p>
     <w:p>
@@ -122,7 +122,7 @@
           <w:rFonts w:ascii="微软雅黑" w:hAnsi="微软雅黑" w:eastAsia="微软雅黑"/>
           <w:sz w:val="22"/>
         </w:rPr>
-        <w:t>&lt;POE2游戏根目录&gt;\Bundles2\_.index.bin</w:t>
+        <w:t>&lt;POE1 或 POE2 游戏根目录&gt;\Bundles2\_.index.bin</w:t>
       </w:r>
     </w:p>
     <w:p>
@@ -135,20 +135,7 @@
           <w:rFonts w:ascii="微软雅黑" w:hAnsi="微软雅黑" w:eastAsia="微软雅黑"/>
           <w:sz w:val="22"/>
         </w:rPr>
-        <w:t>&lt;POE2游戏根目录&gt;\物价补丁\物价补丁.exe</w:t>
-      </w:r>
-    </w:p>
-    <w:p>
-      <w:pPr>
-        <w:pStyle w:val="16"/>
-        <w:spacing w:after="60" w:line="276" w:lineRule="auto"/>
-      </w:pPr>
-      <w:r>
-        <w:rPr>
-          <w:rFonts w:ascii="微软雅黑" w:hAnsi="微软雅黑" w:eastAsia="微软雅黑"/>
-          <w:sz w:val="22"/>
-        </w:rPr>
-        <w:t>&lt;POE2游戏根目录&gt;\物价补丁\物价补丁.exe</w:t>
+        <w:t>&lt;POE 游戏根目录&gt;\物价补丁\物价补丁.exe</w:t>
       </w:r>
     </w:p>
     <w:p>
@@ -467,7 +454,7 @@
           <w:rFonts w:ascii="微软雅黑" w:hAnsi="微软雅黑" w:eastAsia="微软雅黑"/>
           <w:sz w:val="22"/>
         </w:rPr>
-        <w:t>如果发现多个客户端，程序不会猜测，请切换到手动选择。确认后的有效目录会保存，更新与还原下次可复用。国际服仍会读取 language 设置。</w:t>
+        <w:t>如果发现多个客户端，程序不会猜测，请切换到手动选择。确认后的有效目录会保存，更新与还原下次可复用。POE1 还可在 GUI 选择自动识别、汉化补丁、简体中文、繁体中文或跟随游戏配置；自动模式会用最新客户端日志识别第三方汉化补丁。</w:t>
       </w:r>
     </w:p>
     <w:p>
@@ -531,7 +518,7 @@
           <w:rFonts w:ascii="微软雅黑" w:hAnsi="微软雅黑" w:eastAsia="微软雅黑"/>
           <w:sz w:val="22"/>
         </w:rPr>
-        <w:t>3. 在窗口中确认自动识别的路径和客户端类型，或切换到手动选择；更新器还需选择补丁范围。随后程序提取英文表和当前客户端目标语言表。</w:t>
+        <w:t>3. 在窗口中确认自动识别的路径和客户端类型，或切换到手动选择；POE1 还需确认显示语言，更新器还需选择补丁范围。更新与还原必须使用同一目标语言。</w:t>
       </w:r>
     </w:p>
     <w:p>
@@ -543,7 +530,7 @@
           <w:rFonts w:ascii="微软雅黑" w:hAnsi="微软雅黑" w:eastAsia="微软雅黑"/>
           <w:sz w:val="22"/>
         </w:rPr>
-        <w:t>4. 程序会按版本和客户端类型抓取价格：POE1 国际服使用 poe.ninja，POE1 国服使用 poecurrency.top，POE2 国际服优先 poe2scout；异常分类会自动降级，POE1 使用 C/D，POE2 使用 D/E，比例使用当前数据源实时值。同一个显示名对应多个游戏元数据路径时会为全部别名写入价格；国服翻译重名时使用 engname 英文别名消歧，避免漏价或串价。</w:t>
+        <w:t>4. 程序会按版本和客户端类型抓取价格：POE1 国际服使用 poe.ninja 主源，再由 poe2scout 和 PoEDB 逐物品补缺；POE1 国服使用 poecurrency.top 主源，再按 poe.ninja、poe2scout、PoEDB 的顺序补缺；POE2 数据源和 D/E 规则保持不变。各来源独立失败和降级，POE1 使用 C/D，POE2 使用 D/E，比例使用当前数据源实时值。同一个显示名对应多个游戏元数据路径时会为全部别名写入价格；国服翻译重名时使用 engname 英文别名消歧，避免漏价或串价。</w:t>
       </w:r>
     </w:p>
     <w:p>
@@ -555,7 +542,7 @@
           <w:rFonts w:ascii="微软雅黑" w:hAnsi="微软雅黑" w:eastAsia="微软雅黑"/>
           <w:sz w:val="22"/>
         </w:rPr>
-        <w:t>5. 程序会生成“物价补丁.zip”和“还原物价补丁.zip”。Bundles2 模式还会生成“真实还原物价补丁.zip”，并在游戏根目录的 .poe2-price-patch 文件夹保存持久副本。旧版备份丢失时，会先在临时沙盒清理并校验，成功前不修改真实游戏。</w:t>
+        <w:t>5. 程序会生成“物价补丁.zip”和“还原物价补丁.zip”。Bundles2 模式还会生成“真实还原物价补丁.zip”，POE1 和 POE2 分别在游戏根目录的 .poe1-price-patch 与 .poe2-price-patch 文件夹保存持久副本。旧版备份丢失时，会先在临时沙盒清理并校验，成功前不修改真实游戏。</w:t>
       </w:r>
     </w:p>
     <w:p>
@@ -666,7 +653,7 @@
           <w:rFonts w:ascii="微软雅黑" w:hAnsi="微软雅黑" w:eastAsia="微软雅黑"/>
           <w:sz w:val="22"/>
         </w:rPr>
-        <w:t>国服 WeGame：data/balance/simplified chinese/baseitemtypes.datc64。</w:t>
+        <w:t>国服 WeGame：POE1 写入 data/simplified chinese/baseitemtypes.datc64，POE2 写入 data/balance/simplified chinese/baseitemtypes.datc64。</w:t>
       </w:r>
     </w:p>
     <w:p>
@@ -679,7 +666,7 @@
           <w:rFonts w:ascii="微软雅黑" w:hAnsi="微软雅黑" w:eastAsia="微软雅黑"/>
           <w:sz w:val="22"/>
         </w:rPr>
-        <w:t>国际服官方 / Steam / Epic：按当前游戏语言写入，例如繁中为 data/balance/traditional chinese/baseitemtypes.datc64，英文为 data/balance/baseitemtypes.datc64。</w:t>
+        <w:t>国际服官方 / Steam / Epic：POE1 繁中路径为 data/traditional chinese/baseitemtypes.datc64；POE2 繁中路径为 data/balance/traditional chinese/baseitemtypes.datc64。其它语言按各自实际资源表写入。</w:t>
       </w:r>
     </w:p>
     <w:p>
@@ -692,7 +679,7 @@
           <w:rFonts w:ascii="微软雅黑" w:hAnsi="微软雅黑" w:eastAsia="微软雅黑"/>
           <w:sz w:val="22"/>
         </w:rPr>
-        <w:t>需要手动指定语言时，可设置 POE2_PATCH_LANGUAGE，例如 zh-TW、en、ja。</w:t>
+        <w:t>POE1 在 GUI 选择自动识别、汉化补丁、简中、繁中或跟随配置；POE2 可设置 POE2_PATCH_LANGUAGE，例如 zh-TW、en、ja。</w:t>
       </w:r>
     </w:p>
     <w:p>
@@ -783,19 +770,6 @@
           <w:rFonts w:ascii="微软雅黑" w:hAnsi="微软雅黑" w:eastAsia="微软雅黑"/>
           <w:sz w:val="22"/>
         </w:rPr>
-        <w:t>物价补丁.exe：统一 GUI 入口；可选择更新或还原、POE1 或 POE2、自动识别或手动路径。</w:t>
-      </w:r>
-    </w:p>
-    <w:p>
-      <w:pPr>
-        <w:pStyle w:val="16"/>
-        <w:spacing w:after="60" w:line="276" w:lineRule="auto"/>
-      </w:pPr>
-      <w:r>
-        <w:rPr>
-          <w:rFonts w:ascii="微软雅黑" w:hAnsi="微软雅黑" w:eastAsia="微软雅黑"/>
-          <w:sz w:val="22"/>
-        </w:rPr>
         <w:t>物价补丁.zip：运行时生成的当前物价补丁包。</w:t>
       </w:r>
     </w:p>
@@ -822,7 +796,7 @@
           <w:rFonts w:ascii="微软雅黑" w:hAnsi="微软雅黑" w:eastAsia="微软雅黑"/>
           <w:sz w:val="22"/>
         </w:rPr>
-        <w:t>真实还原物价补丁.zip：Bundles2 模式的恢复包；持久副本位于 &lt;游戏根目录&gt;\.poe2-price-patch。</w:t>
+        <w:t>真实还原物价补丁.zip：Bundles2 模式的恢复包；POE1 和 POE2 的持久副本分别位于 &lt;游戏根目录&gt;\.poe1-price-patch 与 &lt;游戏根目录&gt;\.poe2-price-patch。</w:t>
       </w:r>
     </w:p>
     <w:p>
@@ -975,7 +949,7 @@
           <w:rFonts w:ascii="微软雅黑" w:hAnsi="微软雅黑" w:eastAsia="微软雅黑"/>
           <w:sz w:val="22"/>
         </w:rPr>
-        <w:t>缺少价格：可能是当前数据源暂无该物品，或名称无法匹配本地表。低匹配会保留未命中的旧价格；数据源完全不可用时保留当前补丁。</w:t>
+        <w:t>缺少价格：可能是当前数据源暂无该物品，或名称无法匹配本地表。POE1 安装第三方汉化补丁时，请把显示语言设为自动识别或汉化补丁；低匹配会保留未命中的旧价格，数据源完全不可用时保留当前补丁。</w:t>
       </w:r>
     </w:p>
     <w:p>
@@ -1040,7 +1014,7 @@
         <w:color w:val="808080"/>
         <w:sz w:val="18"/>
       </w:rPr>
-      <w:t>POE1 / POE2 物价补丁 v0.5.0</w:t>
+      <w:t>POE1 / POE2 物价补丁 v0.5.2</w:t>
     </w:r>
   </w:p>
 </w:ftr>

</xml_diff>

<commit_message>
fix: detect official GGG install paths
</commit_message>
<xml_diff>
--- a/output/doc/使用文档.docx
+++ b/output/doc/使用文档.docx
@@ -12,7 +12,7 @@
           <w:b/>
           <w:sz w:val="40"/>
         </w:rPr>
-        <w:t>POE1 / POE2 物价补丁使用文档 v0.5.2</w:t>
+        <w:t>POE1 / POE2 物价补丁使用文档 v0.5.3</w:t>
       </w:r>
     </w:p>
     <w:p>
@@ -96,7 +96,7 @@
           <w:b w:val="0"/>
           <w:sz w:val="22"/>
         </w:rPr>
-        <w:t>“物价补丁”文件夹可以放在任意位置。放在游戏根目录下仍可最快识别；放在其它位置时，程序会检查最近目录和各平台游戏库，也可以手动浏览。</w:t>
+        <w:t>“物价补丁”文件夹可以放在任意位置。放在游戏根目录下仍可最快识别；放在其它位置时，程序会检查最近目录、GGG 官服注册表和各平台游戏库，也可以手动浏览。</w:t>
       </w:r>
     </w:p>
     <w:p>
@@ -415,7 +415,7 @@
           <w:rFonts w:ascii="微软雅黑" w:hAnsi="微软雅黑" w:eastAsia="微软雅黑"/>
           <w:sz w:val="22"/>
         </w:rPr>
-        <w:t>自动模式依次检查补丁文件夹上一级、环境变量、最近有效目录、已安装程序、WeGame/Steam 游戏库、Epic 清单和常见位置。</w:t>
+        <w:t>自动模式依次检查补丁文件夹上一级、环境变量、最近有效目录、GGG 官服注册表、已安装程序、WeGame/Steam 游戏库、Epic 清单和常见位置。</w:t>
       </w:r>
     </w:p>
     <w:p>
@@ -1014,7 +1014,7 @@
         <w:color w:val="808080"/>
         <w:sz w:val="18"/>
       </w:rPr>
-      <w:t>POE1 / POE2 物价补丁 v0.5.2</w:t>
+      <w:t>POE1 / POE2 物价补丁 v0.5.3</w:t>
     </w:r>
   </w:p>
 </w:ftr>

</xml_diff>

<commit_message>
release v0.5.4 with POE1 localization
</commit_message>
<xml_diff>
--- a/output/doc/使用文档.docx
+++ b/output/doc/使用文档.docx
@@ -12,7 +12,7 @@
           <w:b/>
           <w:sz w:val="40"/>
         </w:rPr>
-        <w:t>POE1 / POE2 物价补丁使用文档 v0.5.3</w:t>
+        <w:t>POE1 / POE2 物价补丁使用文档 v0.5.4</w:t>
       </w:r>
     </w:p>
     <w:p>
@@ -809,7 +809,7 @@
           <w:rFonts w:ascii="微软雅黑" w:hAnsi="微软雅黑" w:eastAsia="微软雅黑"/>
           <w:sz w:val="22"/>
         </w:rPr>
-        <w:t>tools\dotnet-runtime：内置 .NET 8.0.28 runtime，不要删除；发布包另含校验过的离线修复包，只有两者都不可用时才访问 Microsoft 备用源。</w:t>
+        <w:t>tools\dotnet-runtime：内置 .NET 8.0.28 runtime，不要删除；发布包另含校验过的离线修复包，正常使用不需要联网，只有两者都不可用时才访问 Microsoft 源。</w:t>
       </w:r>
     </w:p>
     <w:p>
@@ -965,6 +965,67 @@
         <w:t>杀软报毒：自制 exe、加密脚本和修改游戏文件都可能触发敏感提示，需要自行判断风险。</w:t>
       </w:r>
     </w:p>
+    <w:p>
+      <w:pPr>
+        <w:spacing w:after="80" w:line="288" w:lineRule="auto"/>
+      </w:pPr>
+      <w:r>
+        <w:rPr>
+          <w:rFonts w:ascii="Microsoft YaHei" w:hAnsi="Microsoft YaHei" w:eastAsia="Microsoft YaHei"/>
+          <w:b/>
+          <w:sz w:val="26"/>
+        </w:rPr>
+        <w:t>POE1 国际服一键汉化</w:t>
+      </w:r>
+    </w:p>
+    <w:p>
+      <w:pPr>
+        <w:spacing w:after="80" w:line="276" w:lineRule="auto"/>
+      </w:pPr>
+      <w:r>
+        <w:rPr>
+          <w:rFonts w:ascii="Microsoft YaHei" w:hAnsi="Microsoft YaHei" w:eastAsia="Microsoft YaHei"/>
+          <w:sz w:val="22"/>
+        </w:rPr>
+        <w:t>1. 在统一窗口选择 POE1，并确认客户端显示为国际服 Steam Bundles2 或国际服官方 GGPK；国服不会启用汉化按钮。</w:t>
+      </w:r>
+    </w:p>
+    <w:p>
+      <w:pPr>
+        <w:spacing w:after="80" w:line="276" w:lineRule="auto"/>
+      </w:pPr>
+      <w:r>
+        <w:rPr>
+          <w:rFonts w:ascii="Microsoft YaHei" w:hAnsi="Microsoft YaHei" w:eastAsia="Microsoft YaHei"/>
+          <w:sz w:val="22"/>
+        </w:rPr>
+        <w:t>2. 点击“一键汉化POE1国际服”。程序每次都会从 PoEDB 推荐的 LibGGPK3 GitHub 最新 Release 下载 PoeChinese3_win-x64.exe；查询和下载均优先使用国内 ghfast.top、gh-proxy.com 加速源，再回退 GitHub 官方源。文件 SHA256 必须匹配最新 Release 公布值，不使用旧缓存。</w:t>
+      </w:r>
+    </w:p>
+    <w:p>
+      <w:pPr>
+        <w:spacing w:after="80" w:line="276" w:lineRule="auto"/>
+      </w:pPr>
+      <w:r>
+        <w:rPr>
+          <w:rFonts w:ascii="Microsoft YaHei" w:hAnsi="Microsoft YaHei" w:eastAsia="Microsoft YaHei"/>
+          <w:sz w:val="22"/>
+        </w:rPr>
+        <w:t>3. 汉化工具完成并显示 Done! 中文化完成! 后，进入 POE1 选择第二个（法文）国旗；程序也会尝试把 production_Config.ini 设为 language=fr。</w:t>
+      </w:r>
+    </w:p>
+    <w:p>
+      <w:pPr>
+        <w:spacing w:after="80" w:line="276" w:lineRule="auto"/>
+      </w:pPr>
+      <w:r>
+        <w:rPr>
+          <w:rFonts w:ascii="Microsoft YaHei" w:hAnsi="Microsoft YaHei" w:eastAsia="Microsoft YaHei"/>
+          <w:sz w:val="22"/>
+        </w:rPr>
+        <w:t>4. 汉化会修改 POE1 游戏包，请关闭游戏和启动器。游戏更新会覆盖已写入的物价与汉化入口；更新完成后请重新汉化及更新物价，更新器会从当前 DAT 动态重建，不依赖固定赛季文件。遇到校验或启动问题时先使用 Steam 验证游戏文件。</w:t>
+      </w:r>
+    </w:p>
     <w:sectPr>
       <w:footerReference r:id="rId5" w:type="default"/>
       <w:pgSz w:w="12240" w:h="15840"/>
@@ -1014,7 +1075,7 @@
         <w:color w:val="808080"/>
         <w:sz w:val="18"/>
       </w:rPr>
-      <w:t>POE1 / POE2 物价补丁 v0.5.3</w:t>
+      <w:t>POE1 / POE2 物价补丁 v0.5.4</w:t>
     </w:r>
   </w:p>
 </w:ftr>

</xml_diff>

<commit_message>
release v0.5.6 with compatible unique price labels
</commit_message>
<xml_diff>
--- a/output/doc/使用文档.docx
+++ b/output/doc/使用文档.docx
@@ -12,7 +12,7 @@
           <w:b/>
           <w:sz w:val="40"/>
         </w:rPr>
-        <w:t>POE1 / POE2 物价补丁使用文档 v0.5.5</w:t>
+        <w:t>POE1 / POE2 物价补丁使用文档 v0.5.6</w:t>
       </w:r>
     </w:p>
     <w:p>
@@ -1068,7 +1068,7 @@
         <w:color w:val="808080"/>
         <w:sz w:val="18"/>
       </w:rPr>
-      <w:t>POE1 / POE2 物价补丁 v0.5.5</w:t>
+      <w:t>POE1 / POE2 物价补丁 v0.5.6</w:t>
     </w:r>
   </w:p>
 </w:ftr>

</xml_diff>

<commit_message>
release v0.5.7 with per-client restore baselines
</commit_message>
<xml_diff>
--- a/output/doc/使用文档.docx
+++ b/output/doc/使用文档.docx
@@ -12,7 +12,7 @@
           <w:b/>
           <w:sz w:val="40"/>
         </w:rPr>
-        <w:t>POE1 / POE2 物价补丁使用文档 v0.5.6</w:t>
+        <w:t>POE1 / POE2 物价补丁使用文档 v0.5.7</w:t>
       </w:r>
     </w:p>
     <w:p>
@@ -535,7 +535,7 @@
           <w:rFonts w:ascii="微软雅黑" w:hAnsi="微软雅黑" w:eastAsia="微软雅黑"/>
           <w:sz w:val="22"/>
         </w:rPr>
-        <w:t>5. 程序会生成“物价补丁.zip”和“还原物价补丁.zip”。Bundles2 模式还会生成“真实还原物价补丁.zip”，POE1 和 POE2 分别在游戏根目录的 .poe1-price-patch 与 .poe2-price-patch 文件夹保存持久副本。旧版备份丢失时，会先在临时沙盒清理并校验，成功前不修改真实游戏。</w:t>
+        <w:t>5. 程序会生成物价补丁和按 POE1/POE2、客户端类型、目标语言独立命名的还原基线；工作输出再按游戏目录哈希隔离。权威副本只保存在对应游戏根目录的 .poe1-price-patch 或 .poe2-price-patch，官方 GGPK、Steam/Epic 与国服不会互相覆盖；连续更新只复用第一次验证通过的干净基线。</w:t>
       </w:r>
     </w:p>
     <w:p>
@@ -620,7 +620,7 @@
           <w:rFonts w:ascii="微软雅黑" w:hAnsi="微软雅黑" w:eastAsia="微软雅黑"/>
           <w:sz w:val="22"/>
         </w:rPr>
-        <w:t>5. 如果没有物理还原包，程序会验证逻辑还原包，并以当前 Bundles2 的 Words/EndgameMaps 为底板只清理本工具标记；没有安全兼容路径时才会拒绝还原。</w:t>
+        <w:t>5. 如果专属还原基线丢失或过期，程序会在临时目录只清除能够确认属于本工具的 BaseItemTypes、Words 与岛屿提示，结构和零残留校验通过后自动重建；只有无法证明安全时才会拒绝并提示平台修复。</w:t>
       </w:r>
     </w:p>
     <w:p>
@@ -789,7 +789,7 @@
           <w:rFonts w:ascii="微软雅黑" w:hAnsi="微软雅黑" w:eastAsia="微软雅黑"/>
           <w:sz w:val="22"/>
         </w:rPr>
-        <w:t>• 真实还原物价补丁.zip：Bundles2 模式的恢复包；POE1 和 POE2 的持久副本分别位于 &lt;游戏根目录&gt;\.poe1-price-patch 与 &lt;游戏根目录&gt;\.poe2-price-patch。</w:t>
+        <w:t>• POE1/POE2 专属还原包：名称包含客户端类型和语言；Bundles2 还会保存物理恢复包。持久副本分别位于 &lt;游戏根目录&gt;\.poe1-price-patch 与 &lt;游戏根目录&gt;\.poe2-price-patch。</w:t>
       </w:r>
     </w:p>
     <w:p>
@@ -1068,7 +1068,7 @@
         <w:color w:val="808080"/>
         <w:sz w:val="18"/>
       </w:rPr>
-      <w:t>POE1 / POE2 物价补丁 v0.5.6</w:t>
+      <w:t>POE1 / POE2 物价补丁 v0.5.7</w:t>
     </w:r>
   </w:p>
 </w:ftr>

</xml_diff>

<commit_message>
release v0.5.8 with localization and price parsing fixes
</commit_message>
<xml_diff>
--- a/output/doc/使用文档.docx
+++ b/output/doc/使用文档.docx
@@ -12,7 +12,7 @@
           <w:b/>
           <w:sz w:val="40"/>
         </w:rPr>
-        <w:t>POE1 / POE2 物价补丁使用文档 v0.5.7</w:t>
+        <w:t>POE1 / POE2 物价补丁使用文档 v0.5.8</w:t>
       </w:r>
     </w:p>
     <w:p>
@@ -942,7 +942,7 @@
           <w:rFonts w:ascii="微软雅黑" w:hAnsi="微软雅黑" w:eastAsia="微软雅黑"/>
           <w:sz w:val="22"/>
         </w:rPr>
-        <w:t>• 缺少价格：可能是当前数据源暂无该物品，或名称无法匹配本地表。POE1 安装第三方汉化补丁时，请把显示语言设为自动识别或汉化补丁；低匹配会保留未命中的旧价格，数据源完全不可用时保留当前补丁。</w:t>
+        <w:t>• 缺少价格：可能是当前数据源暂无该物品，或名称无法匹配本地表。POE1 安装第三方汉化补丁时，请把显示语言设为自动识别或汉化补丁；低匹配会保留未命中的旧价格，数据源完全不可用时保留当前补丁。POE1 传奇写成 传奇名[&lt;&lt;价格&gt;&gt;]，POE2 写成 [价格|传奇名]；易刷与 PoE Overlay II 会按对应格式清理价格后使用精确传奇名查询。</w:t>
       </w:r>
     </w:p>
     <w:p>
@@ -973,50 +973,50 @@
     </w:p>
     <w:p>
       <w:pPr>
-        <w:spacing w:after="80" w:line="276" w:lineRule="auto"/>
+        <w:spacing w:after="40" w:line="252" w:lineRule="auto"/>
       </w:pPr>
       <w:r>
         <w:rPr>
           <w:rFonts w:ascii="Microsoft YaHei" w:hAnsi="Microsoft YaHei" w:eastAsia="Microsoft YaHei"/>
-          <w:sz w:val="22"/>
+          <w:sz w:val="21"/>
         </w:rPr>
-        <w:t>1. 在统一窗口选择 POE1，并确认客户端显示为国际服 Steam Bundles2 或国际服官方 GGPK；国服不会启用汉化按钮。</w:t>
+        <w:t>1. 选择 POE1 国际服 Steam Bundles2 或官方 GGPK；国服不会启用汉化按钮。</w:t>
       </w:r>
     </w:p>
     <w:p>
       <w:pPr>
-        <w:spacing w:after="80" w:line="276" w:lineRule="auto"/>
+        <w:spacing w:after="40" w:line="252" w:lineRule="auto"/>
       </w:pPr>
       <w:r>
         <w:rPr>
           <w:rFonts w:ascii="Microsoft YaHei" w:hAnsi="Microsoft YaHei" w:eastAsia="Microsoft YaHei"/>
-          <w:sz w:val="22"/>
+          <w:sz w:val="21"/>
         </w:rPr>
-        <w:t>2. 点击“一键汉化POE1国际服”。程序每次都会从 PoEDB 推荐的 LibGGPK3 GitHub 最新 Release 下载 PoeChinese3_win-x64.exe；查询和下载均优先使用国内 ghfast.top、gh-proxy.com 加速源，再回退 GitHub 官方源。文件 SHA256 必须匹配最新 Release 公布值，不使用旧缓存。</w:t>
+        <w:t>2. 点击“一键汉化POE1国际服”。程序每次都会从 PoEDB 推荐的 LibGGPK3 GitHub 最新 Release 下载 PoeChinese3_win-x64.exe；依次使用 ghfast.top、gh-proxy.com、gh.ddlc.top、ghproxy.it、github.boki.moe、ghproxy.net、gh.jasonzeng.dev、gh.monlor.com，最后回退 GitHub 官方源。SHA256 必须匹配，API 可用时还会严格匹配文件大小；不使用旧缓存，窗口持续显示已运行秒数和当前阶段。</w:t>
       </w:r>
     </w:p>
     <w:p>
       <w:pPr>
-        <w:spacing w:after="80" w:line="276" w:lineRule="auto"/>
+        <w:spacing w:after="40" w:line="252" w:lineRule="auto"/>
       </w:pPr>
       <w:r>
         <w:rPr>
           <w:rFonts w:ascii="Microsoft YaHei" w:hAnsi="Microsoft YaHei" w:eastAsia="Microsoft YaHei"/>
-          <w:sz w:val="22"/>
+          <w:sz w:val="21"/>
         </w:rPr>
-        <w:t>3. 汉化工具完成并显示 Done! 中文化完成! 后，进入 POE1 选择第二个（法文）国旗；程序也会尝试把 production_Config.ini 设为 language=fr。</w:t>
+        <w:t>3. 完成后在 POE1 选择第二个（法文）国旗；程序会尝试把 production_Config.ini 设为 language=fr。</w:t>
       </w:r>
     </w:p>
     <w:p>
       <w:pPr>
-        <w:spacing w:after="80" w:line="276" w:lineRule="auto"/>
+        <w:spacing w:after="40" w:line="252" w:lineRule="auto"/>
       </w:pPr>
       <w:r>
         <w:rPr>
           <w:rFonts w:ascii="Microsoft YaHei" w:hAnsi="Microsoft YaHei" w:eastAsia="Microsoft YaHei"/>
-          <w:sz w:val="22"/>
+          <w:sz w:val="21"/>
         </w:rPr>
-        <w:t>4. 汉化会修改 POE1 游戏包，请关闭游戏和启动器。游戏更新会覆盖已写入的物价与汉化入口；更新完成后请重新汉化及更新物价，更新器会从当前 DAT 动态重建，不依赖固定赛季文件。遇到校验或启动问题时先使用 Steam 验证游戏文件。</w:t>
+        <w:t>4. 汉化会修改游戏包，请关闭游戏和启动器。游戏更新后需重新汉化并更新物价；校验或启动异常时先用 Steam 验证游戏文件。</w:t>
       </w:r>
     </w:p>
     <w:sectPr>
@@ -1068,7 +1068,7 @@
         <w:color w:val="808080"/>
         <w:sz w:val="18"/>
       </w:rPr>
-      <w:t>POE1 / POE2 物价补丁 v0.5.7</w:t>
+      <w:t>POE1 / POE2 物价补丁 v0.5.8</w:t>
     </w:r>
   </w:p>
 </w:ftr>

</xml_diff>